<commit_message>
Uploaded data for 2026-03-12:14-14-52
</commit_message>
<xml_diff>
--- a/Ggsc/8 Marxismus/Marx Dossier 26.docx
+++ b/Ggsc/8 Marxismus/Marx Dossier 26.docx
@@ -2888,6 +2888,15 @@
         </w:rPr>
         <w:t>Maschienen haben Amortistationslosten und Mehrwert Proft. Menschen haben Existenz- und Fortpflanzungskosten und Mehrwert. Bei Maschienen kann man so tief runtergehen, dass man nur noch Amortisiert. Nach Marx seiner Theorie wird jedoch die Konkurenz den Mehrwert bei Menschen nicht runterdrücken.</w:t>
       </w:r>
+      <w:r>
+        <w:rPr>
+          <w:rFonts w:asciiTheme="minorHAnsi" w:hAnsiTheme="minorHAnsi" w:cstheme="minorHAnsi"/>
+          <w:sz w:val="22"/>
+          <w:szCs w:val="32"/>
+          <w:lang w:val="de-CH"/>
+        </w:rPr>
+        <w:t xml:space="preserve"> Nur aus Menschen kann Mehrwertt gewonnen werden, aber sie werden durch Maschienen ersetzt aufgrund des Drucks der freien Marktwirtschaft.</w:t>
+      </w:r>
     </w:p>
     <w:p>
       <w:pPr>
@@ -2932,16 +2941,7 @@
           <w:szCs w:val="32"/>
           <w:lang w:val="de-CH"/>
         </w:rPr>
-        <w:t>Nur aus Menschen kann Profit gezogen werden, wenn immer weniger Leute auf dem Arbeitsmarkt sind, müssen anderen Leute ausgebeutet werden und immer mehr werden Arbeitslos.</w:t>
-      </w:r>
-      <w:r>
-        <w:rPr>
-          <w:rFonts w:asciiTheme="minorHAnsi" w:hAnsiTheme="minorHAnsi" w:cstheme="minorHAnsi"/>
-          <w:sz w:val="22"/>
-          <w:szCs w:val="32"/>
-          <w:lang w:val="de-CH"/>
-        </w:rPr>
-        <w:t xml:space="preserve"> </w:t>
+        <w:t xml:space="preserve">Nur aus Menschen kann Profit gezogen werden, wenn immer weniger Leute auf dem Arbeitsmarkt sind, müssen anderen Leute ausgebeutet werden und immer mehr werden Arbeitslos. </w:t>
       </w:r>
       <w:r>
         <w:rPr>
@@ -3234,7 +3234,7 @@
         </w:rPr>
         <w:lastRenderedPageBreak/>
         <w:drawing>
-          <wp:inline distT="0" distB="0" distL="0" distR="0" wp14:anchorId="605DAD80" wp14:editId="310B4F01">
+          <wp:inline distT="0" distB="0" distL="0" distR="0" wp14:anchorId="605DAD80" wp14:editId="4BE0EEAB">
             <wp:extent cx="6336665" cy="3742690"/>
             <wp:effectExtent l="12700" t="12700" r="13335" b="16510"/>
             <wp:docPr id="1296232420" name="Grafik 9" descr="Ein Bild, das Text, Screenshot, Schrift, Diagramm enthält.&#10;&#10;KI-generierte Inhalte können fehlerhaft sein."/>
@@ -3575,9 +3575,52 @@
           <w:rFonts w:asciiTheme="minorHAnsi" w:hAnsiTheme="minorHAnsi" w:cstheme="minorHAnsi"/>
           <w:sz w:val="20"/>
           <w:szCs w:val="20"/>
-          <w:lang w:val="de-CH"/>
-        </w:rPr>
-        <w:t>Die Geschichte der bisherigen Gesellschaft ist die Geschichte von Klassenkämpfen. Freier und Sklave, Patrizier und Plebejer, Baron und Leibeigener, Zunftbürger und Gesell, kurz, Unterdrücker und Unterdrückte standen in stetem Gegensatz zueinander, führten einen ununterbrochenen, bald versteckten, bald offenen Kampf, einen Kampf, der jedesmal mit einer revolutionären Umgestaltung der ganzen Gesellschaft endete oder mit dem gemeinsamen Untergang der kämpfenden Klassen. ...</w:t>
+          <w:highlight w:val="yellow"/>
+          <w:lang w:val="de-CH"/>
+        </w:rPr>
+        <w:t>Die Geschichte der bisherigen Gesellschaft ist die Geschichte von Klassenkämpfen</w:t>
+      </w:r>
+      <w:r>
+        <w:rPr>
+          <w:rStyle w:val="LineNumber"/>
+          <w:rFonts w:asciiTheme="minorHAnsi" w:hAnsiTheme="minorHAnsi" w:cstheme="minorHAnsi"/>
+          <w:sz w:val="20"/>
+          <w:szCs w:val="20"/>
+          <w:lang w:val="de-CH"/>
+        </w:rPr>
+        <w:t xml:space="preserve">. Freier und Sklave, Patrizier und Plebejer, Baron und Leibeigener, Zunftbürger und Gesell, kurz, Unterdrücker und Unterdrückte standen in stetem Gegensatz zueinander, führten einen ununterbrochenen, bald versteckten, bald offenen Kampf, einen Kampf, </w:t>
+      </w:r>
+      <w:r>
+        <w:rPr>
+          <w:rStyle w:val="LineNumber"/>
+          <w:rFonts w:asciiTheme="minorHAnsi" w:hAnsiTheme="minorHAnsi" w:cstheme="minorHAnsi"/>
+          <w:sz w:val="20"/>
+          <w:szCs w:val="20"/>
+          <w:highlight w:val="yellow"/>
+          <w:lang w:val="de-CH"/>
+        </w:rPr>
+        <w:t>der jedesmal mit einer revolutionären Umgestaltung der ganzen Gesellschaft</w:t>
+      </w:r>
+      <w:r>
+        <w:rPr>
+          <w:rStyle w:val="LineNumber"/>
+          <w:rFonts w:asciiTheme="minorHAnsi" w:hAnsiTheme="minorHAnsi" w:cstheme="minorHAnsi"/>
+          <w:sz w:val="20"/>
+          <w:szCs w:val="20"/>
+          <w:lang w:val="de-CH"/>
+        </w:rPr>
+        <w:t xml:space="preserve"> endete oder mit dem gemeinsamen </w:t>
+      </w:r>
+      <w:r>
+        <w:rPr>
+          <w:rStyle w:val="LineNumber"/>
+          <w:rFonts w:asciiTheme="minorHAnsi" w:hAnsiTheme="minorHAnsi" w:cstheme="minorHAnsi"/>
+          <w:sz w:val="20"/>
+          <w:szCs w:val="20"/>
+          <w:highlight w:val="yellow"/>
+          <w:lang w:val="de-CH"/>
+        </w:rPr>
+        <w:t>Untergang der kämpfenden Klassen. ...</w:t>
       </w:r>
     </w:p>
     <w:p>
@@ -3599,7 +3642,18 @@
           <w:szCs w:val="20"/>
           <w:lang w:val="de-CH"/>
         </w:rPr>
-        <w:t>Unsere Epoche, die Epoche der Bourgeoisie, zeichnet sich jedoch dadurch aus, dass sie die Klassengegensätze vereinfacht hat. Die ganze Gesellschaft spaltet sich mehr und mehr in zwei grosse feindliche Lager, in zwei grosse, einander direkt gegenüberstehende Klassen: Bourgeoisie und Proletariat, ...</w:t>
+        <w:t xml:space="preserve">Unsere Epoche, die Epoche der Bourgeoisie, zeichnet sich jedoch dadurch aus, dass sie die Klassengegensätze vereinfacht hat. Die ganze Gesellschaft spaltet sich mehr und mehr in </w:t>
+      </w:r>
+      <w:r>
+        <w:rPr>
+          <w:rStyle w:val="LineNumber"/>
+          <w:rFonts w:asciiTheme="minorHAnsi" w:hAnsiTheme="minorHAnsi" w:cstheme="minorHAnsi"/>
+          <w:sz w:val="20"/>
+          <w:szCs w:val="20"/>
+          <w:highlight w:val="yellow"/>
+          <w:lang w:val="de-CH"/>
+        </w:rPr>
+        <w:t>zwei grosse feindliche Lager, in zwei grosse, einander direkt gegenüberstehende Klassen: Bourgeoisie und Proletariat, ...</w:t>
       </w:r>
     </w:p>
     <w:p>
@@ -3621,7 +3675,28 @@
           <w:szCs w:val="20"/>
           <w:lang w:val="de-CH"/>
         </w:rPr>
-        <w:t>Die Bourgeoisie kann nicht existieren, ohne die Produktionsinstrumente ... fortwährend zu revolutionieren. ... Das Bedürfnis nach einem stets ausgedehnteren Absatz für ihre Produkte jagt die Bourgeoisie über die ganze Erdkugel. Überall muss sie sich einnisten, überall anbauen, überall Verbindungen herstellen. ...</w:t>
+        <w:t xml:space="preserve">Die Bourgeoisie kann nicht existieren, ohne die Produktionsinstrumente ... fortwährend zu revolutionieren. ... Das Bedürfnis nach einem stets ausgedehnteren </w:t>
+      </w:r>
+      <w:r>
+        <w:rPr>
+          <w:rStyle w:val="LineNumber"/>
+          <w:rFonts w:asciiTheme="minorHAnsi" w:hAnsiTheme="minorHAnsi" w:cstheme="minorHAnsi"/>
+          <w:sz w:val="20"/>
+          <w:szCs w:val="20"/>
+          <w:highlight w:val="yellow"/>
+          <w:lang w:val="de-CH"/>
+        </w:rPr>
+        <w:t>Absatz für ihre Produkte jagt die Bourgeoisie über die ganze Erdkugel</w:t>
+      </w:r>
+      <w:r>
+        <w:rPr>
+          <w:rStyle w:val="LineNumber"/>
+          <w:rFonts w:asciiTheme="minorHAnsi" w:hAnsiTheme="minorHAnsi" w:cstheme="minorHAnsi"/>
+          <w:sz w:val="20"/>
+          <w:szCs w:val="20"/>
+          <w:lang w:val="de-CH"/>
+        </w:rPr>
+        <w:t>. Überall muss sie sich einnisten, überall anbauen, überall Verbindungen herstellen. ...</w:t>
       </w:r>
     </w:p>
     <w:p>
@@ -3646,7 +3721,28 @@
           <w:szCs w:val="20"/>
           <w:lang w:val="de-CH"/>
         </w:rPr>
-        <w:t>Die bürgerlichen Produktions- und Verkehrsverhältnisse, die bürgerlichen Eigentumsverhältnisse, die moderne bürgerliche Gesellschaft, die [durch das Prinzip der freien Konkurrenz] so gewaltige Produktions- und Verkehrsmittel hervorgezaubert hat, gleicht dem Hexenmeister, der die unterirdischen Gewalten nicht mehr zu beherrschen vermag, die er heraufbeschwor. ...</w:t>
+        <w:t xml:space="preserve">Die bürgerlichen Produktions- und Verkehrsverhältnisse, die bürgerlichen Eigentumsverhältnisse, die moderne bürgerliche Gesellschaft, die [durch das Prinzip der freien Konkurrenz] </w:t>
+      </w:r>
+      <w:r>
+        <w:rPr>
+          <w:rStyle w:val="LineNumber"/>
+          <w:rFonts w:asciiTheme="minorHAnsi" w:hAnsiTheme="minorHAnsi" w:cstheme="minorHAnsi"/>
+          <w:sz w:val="20"/>
+          <w:szCs w:val="20"/>
+          <w:highlight w:val="yellow"/>
+          <w:lang w:val="de-CH"/>
+        </w:rPr>
+        <w:t>so gewaltige Produktions- und Verkehrsmittel hervorgezaubert hat, gleicht dem Hexenmeister</w:t>
+      </w:r>
+      <w:r>
+        <w:rPr>
+          <w:rStyle w:val="LineNumber"/>
+          <w:rFonts w:asciiTheme="minorHAnsi" w:hAnsiTheme="minorHAnsi" w:cstheme="minorHAnsi"/>
+          <w:sz w:val="20"/>
+          <w:szCs w:val="20"/>
+          <w:lang w:val="de-CH"/>
+        </w:rPr>
+        <w:t>, der die unterirdischen Gewalten nicht mehr zu beherrschen vermag, die er heraufbeschwor. ...</w:t>
       </w:r>
     </w:p>
     <w:p>
@@ -3666,9 +3762,41 @@
           <w:rFonts w:asciiTheme="minorHAnsi" w:hAnsiTheme="minorHAnsi" w:cstheme="minorHAnsi"/>
           <w:sz w:val="20"/>
           <w:szCs w:val="20"/>
-          <w:lang w:val="de-CH"/>
-        </w:rPr>
-        <w:t>Es genügt die Handelskrisen zu nennen, welche in ihrer periodischen Wiederkehr immer drohender die Existenz der ganzen bürgerlichen Gesellschaft in Frage stellen. In den Handelskrisen wird ein grosser Teil nicht nur der erzeugten Produkte, sondern der bereits geschaffenen Produktivkräfte regelmässig vernichtet. In den Krisen bricht eine gesellschaftliche Epidemie aus, welche allen früheren Epochen als Widersinn erschienen wäre – die Epidemie der Überproduktion. ...</w:t>
+          <w:highlight w:val="yellow"/>
+          <w:lang w:val="de-CH"/>
+        </w:rPr>
+        <w:t>Es genügt die Handelskrisen zu nennen</w:t>
+      </w:r>
+      <w:r>
+        <w:rPr>
+          <w:rStyle w:val="LineNumber"/>
+          <w:rFonts w:asciiTheme="minorHAnsi" w:hAnsiTheme="minorHAnsi" w:cstheme="minorHAnsi"/>
+          <w:sz w:val="20"/>
+          <w:szCs w:val="20"/>
+          <w:lang w:val="de-CH"/>
+        </w:rPr>
+        <w:t xml:space="preserve">, welche in ihrer periodischen Wiederkehr immer drohender die Existenz der ganzen bürgerlichen Gesellschaft in Frage stellen. In den Handelskrisen wird ein grosser Teil nicht nur der erzeugten Produkte, sondern der </w:t>
+      </w:r>
+      <w:r>
+        <w:rPr>
+          <w:rStyle w:val="LineNumber"/>
+          <w:rFonts w:asciiTheme="minorHAnsi" w:hAnsiTheme="minorHAnsi" w:cstheme="minorHAnsi"/>
+          <w:sz w:val="20"/>
+          <w:szCs w:val="20"/>
+          <w:highlight w:val="yellow"/>
+          <w:lang w:val="de-CH"/>
+        </w:rPr>
+        <w:t>bereits geschaffenen Produktivkräfte regelmässig vernichtet</w:t>
+      </w:r>
+      <w:r>
+        <w:rPr>
+          <w:rStyle w:val="LineNumber"/>
+          <w:rFonts w:asciiTheme="minorHAnsi" w:hAnsiTheme="minorHAnsi" w:cstheme="minorHAnsi"/>
+          <w:sz w:val="20"/>
+          <w:szCs w:val="20"/>
+          <w:lang w:val="de-CH"/>
+        </w:rPr>
+        <w:t>. In den Krisen bricht eine gesellschaftliche Epidemie aus, welche allen früheren Epochen als Widersinn erschienen wäre – die Epidemie der Überproduktion. ...</w:t>
       </w:r>
     </w:p>
     <w:p>
@@ -3688,9 +3816,41 @@
           <w:rFonts w:asciiTheme="minorHAnsi" w:hAnsiTheme="minorHAnsi" w:cstheme="minorHAnsi"/>
           <w:sz w:val="20"/>
           <w:szCs w:val="20"/>
-          <w:lang w:val="de-CH"/>
-        </w:rPr>
-        <w:t>Die Waffen, womit die Bourgeoisie den Feudalismus zu Boden geschlagen hat, richten sich jetzt gegen die Bourgeoisie selbst. Aber die Bourgeoisie hat nicht nur die Waffen geschmiedet, die ihr den Tod bringen; sie hat auch die Männer gezeugt, die diese Waffen führen werden – die modernen Arbeiter, die Proletarier.</w:t>
+          <w:highlight w:val="yellow"/>
+          <w:lang w:val="de-CH"/>
+        </w:rPr>
+        <w:t>Die Waffen, womit die Bourgeoisie den Feudalismus zu Boden geschlagen hat, richten sich jetzt gegen die Bourgeoisie selbst</w:t>
+      </w:r>
+      <w:r>
+        <w:rPr>
+          <w:rStyle w:val="LineNumber"/>
+          <w:rFonts w:asciiTheme="minorHAnsi" w:hAnsiTheme="minorHAnsi" w:cstheme="minorHAnsi"/>
+          <w:sz w:val="20"/>
+          <w:szCs w:val="20"/>
+          <w:lang w:val="de-CH"/>
+        </w:rPr>
+        <w:t xml:space="preserve">. Aber die Bourgeoisie hat nicht nur die Waffen geschmiedet, die ihr den Tod bringen; sie hat auch die Männer gezeugt, die diese Waffen führen werden – </w:t>
+      </w:r>
+      <w:r>
+        <w:rPr>
+          <w:rStyle w:val="LineNumber"/>
+          <w:rFonts w:asciiTheme="minorHAnsi" w:hAnsiTheme="minorHAnsi" w:cstheme="minorHAnsi"/>
+          <w:sz w:val="20"/>
+          <w:szCs w:val="20"/>
+          <w:highlight w:val="yellow"/>
+          <w:lang w:val="de-CH"/>
+        </w:rPr>
+        <w:t>die modernen Arbeiter, die Proletarier</w:t>
+      </w:r>
+      <w:r>
+        <w:rPr>
+          <w:rStyle w:val="LineNumber"/>
+          <w:rFonts w:asciiTheme="minorHAnsi" w:hAnsiTheme="minorHAnsi" w:cstheme="minorHAnsi"/>
+          <w:sz w:val="20"/>
+          <w:szCs w:val="20"/>
+          <w:lang w:val="de-CH"/>
+        </w:rPr>
+        <w:t>.</w:t>
       </w:r>
     </w:p>
     <w:p>
@@ -3909,6 +4069,124 @@
           <w:lang w:val="de-CH"/>
         </w:rPr>
         <w:t xml:space="preserve"> (L. 1f)</w:t>
+      </w:r>
+    </w:p>
+    <w:tbl>
+      <w:tblPr>
+        <w:tblStyle w:val="TableGrid"/>
+        <w:tblW w:w="0" w:type="auto"/>
+        <w:tblInd w:w="279" w:type="dxa"/>
+        <w:tblBorders>
+          <w:top w:val="none" w:sz="0" w:space="0" w:color="auto"/>
+          <w:left w:val="none" w:sz="0" w:space="0" w:color="auto"/>
+          <w:bottom w:val="none" w:sz="0" w:space="0" w:color="auto"/>
+          <w:right w:val="none" w:sz="0" w:space="0" w:color="auto"/>
+          <w:insideH w:val="none" w:sz="0" w:space="0" w:color="auto"/>
+          <w:insideV w:val="none" w:sz="0" w:space="0" w:color="auto"/>
+        </w:tblBorders>
+        <w:tblLook w:val="04A0" w:firstRow="1" w:lastRow="0" w:firstColumn="1" w:lastColumn="0" w:noHBand="0" w:noVBand="1"/>
+      </w:tblPr>
+      <w:tblGrid>
+        <w:gridCol w:w="9690"/>
+      </w:tblGrid>
+      <w:tr>
+        <w:tc>
+          <w:tcPr>
+            <w:tcW w:w="9690" w:type="dxa"/>
+          </w:tcPr>
+          <w:p>
+            <w:pPr>
+              <w:jc w:val="both"/>
+              <w:rPr>
+                <w:rFonts w:asciiTheme="minorHAnsi" w:hAnsiTheme="minorHAnsi" w:cstheme="minorHAnsi"/>
+                <w:sz w:val="20"/>
+                <w:lang w:val="de-CH"/>
+              </w:rPr>
+            </w:pPr>
+          </w:p>
+          <w:p>
+            <w:pPr>
+              <w:jc w:val="both"/>
+              <w:rPr>
+                <w:rFonts w:asciiTheme="minorHAnsi" w:hAnsiTheme="minorHAnsi" w:cstheme="minorHAnsi"/>
+                <w:sz w:val="20"/>
+                <w:lang w:val="de-CH"/>
+              </w:rPr>
+            </w:pPr>
+            <w:r>
+              <w:rPr>
+                <w:rFonts w:asciiTheme="minorHAnsi" w:hAnsiTheme="minorHAnsi" w:cstheme="minorHAnsi"/>
+                <w:sz w:val="20"/>
+                <w:lang w:val="de-CH"/>
+              </w:rPr>
+              <w:t>Nach der Verelendungstheorie kamen in den verschiedenen Epochen immer mehr Personen aus der besitzenden Klassein die besitzlose Klasse. Dies wurde solang weiterge</w:t>
+            </w:r>
+            <w:r>
+              <w:rPr>
+                <w:rFonts w:asciiTheme="minorHAnsi" w:hAnsiTheme="minorHAnsi" w:cstheme="minorHAnsi"/>
+                <w:sz w:val="20"/>
+                <w:lang w:val="de-CH"/>
+              </w:rPr>
+              <w:t>führt, bsi sich die besitzlose Klasse, das Proletariat, gegen die Geschehnise wärte und das system änderte mit einer Revolution.</w:t>
+            </w:r>
+          </w:p>
+          <w:p>
+            <w:pPr>
+              <w:jc w:val="both"/>
+              <w:rPr>
+                <w:rFonts w:asciiTheme="minorHAnsi" w:hAnsiTheme="minorHAnsi" w:cstheme="minorHAnsi"/>
+                <w:sz w:val="20"/>
+                <w:lang w:val="de-CH"/>
+              </w:rPr>
+            </w:pPr>
+          </w:p>
+          <w:p>
+            <w:pPr>
+              <w:jc w:val="both"/>
+              <w:rPr>
+                <w:rFonts w:asciiTheme="minorHAnsi" w:hAnsiTheme="minorHAnsi" w:cstheme="minorHAnsi"/>
+                <w:sz w:val="20"/>
+                <w:lang w:val="de-CH"/>
+              </w:rPr>
+            </w:pPr>
+          </w:p>
+        </w:tc>
+      </w:tr>
+    </w:tbl>
+    <w:p>
+      <w:pPr>
+        <w:numPr>
+          <w:ilvl w:val="0"/>
+          <w:numId w:val="1"/>
+        </w:numPr>
+        <w:spacing w:before="80"/>
+        <w:ind w:left="284" w:hanging="284"/>
+        <w:jc w:val="both"/>
+        <w:rPr>
+          <w:rFonts w:asciiTheme="minorHAnsi" w:hAnsiTheme="minorHAnsi" w:cstheme="minorHAnsi"/>
+          <w:iCs/>
+          <w:sz w:val="20"/>
+          <w:lang w:val="de-CH"/>
+        </w:rPr>
+      </w:pPr>
+      <w:r>
+        <w:rPr>
+          <w:rFonts w:asciiTheme="minorHAnsi" w:hAnsiTheme="minorHAnsi" w:cstheme="minorHAnsi"/>
+          <w:iCs/>
+          <w:sz w:val="20"/>
+          <w:lang w:val="de-CH"/>
+        </w:rPr>
+        <w:lastRenderedPageBreak/>
+        <w:t>Erläutern Sie den Satz: „Die Bourgeoisie kann nicht existieren, ohne die Produktionsinstrumente ... fortwährend zu revolutionieren.“</w:t>
+      </w:r>
+      <w:r>
+        <w:rPr>
+          <w:rFonts w:asciiTheme="minorHAnsi" w:hAnsiTheme="minorHAnsi" w:cstheme="minorHAnsi"/>
+          <w:iCs/>
+          <w:sz w:val="20"/>
+          <w:lang w:val="de-CH"/>
+        </w:rPr>
+        <w:t xml:space="preserve"> (L 16f)</w:t>
       </w:r>
     </w:p>
     <w:tbl>
@@ -3947,17 +4225,60 @@
                 <w:lang w:val="de-CH"/>
               </w:rPr>
             </w:pPr>
-          </w:p>
-          <w:p>
-            <w:pPr>
-              <w:jc w:val="both"/>
+            <w:r>
               <w:rPr>
                 <w:rFonts w:asciiTheme="minorHAnsi" w:hAnsiTheme="minorHAnsi" w:cstheme="minorHAnsi"/>
                 <w:iCs/>
                 <w:sz w:val="20"/>
                 <w:lang w:val="de-CH"/>
               </w:rPr>
-            </w:pPr>
+              <w:t>Da nach</w:t>
+            </w:r>
+            <w:r>
+              <w:rPr>
+                <w:rFonts w:asciiTheme="minorHAnsi" w:hAnsiTheme="minorHAnsi" w:cstheme="minorHAnsi"/>
+                <w:iCs/>
+                <w:sz w:val="20"/>
+                <w:lang w:val="de-CH"/>
+              </w:rPr>
+              <w:t xml:space="preserve"> der Mehrwerttheorie</w:t>
+            </w:r>
+            <w:r>
+              <w:rPr>
+                <w:rFonts w:asciiTheme="minorHAnsi" w:hAnsiTheme="minorHAnsi" w:cstheme="minorHAnsi"/>
+                <w:iCs/>
+                <w:sz w:val="20"/>
+                <w:lang w:val="de-CH"/>
+              </w:rPr>
+              <w:t xml:space="preserve">, bei den maschniellen </w:t>
+            </w:r>
+            <w:r>
+              <w:rPr>
+                <w:rFonts w:asciiTheme="minorHAnsi" w:hAnsiTheme="minorHAnsi" w:cstheme="minorHAnsi"/>
+                <w:iCs/>
+                <w:sz w:val="20"/>
+                <w:lang w:val="de-CH"/>
+              </w:rPr>
+              <w:t xml:space="preserve">Produktionsinstrumente </w:t>
+            </w:r>
+            <w:r>
+              <w:rPr>
+                <w:rFonts w:asciiTheme="minorHAnsi" w:hAnsiTheme="minorHAnsi" w:cstheme="minorHAnsi"/>
+                <w:iCs/>
+                <w:sz w:val="20"/>
+                <w:lang w:val="de-CH"/>
+              </w:rPr>
+              <w:t xml:space="preserve">die Profitkosten immer weinter nach unten geschraubt werden können bis </w:t>
+            </w:r>
+            <w:r>
+              <w:rPr>
+                <w:rFonts w:asciiTheme="minorHAnsi" w:hAnsiTheme="minorHAnsi" w:cstheme="minorHAnsi"/>
+                <w:iCs/>
+                <w:sz w:val="20"/>
+                <w:lang w:val="de-CH"/>
+              </w:rPr>
+              <w:t>die Amortisationskosten nur gerade gedeckt werden, muss die Bourgeoisie bessere Instrumente entwickeln, um diese Amortisationskosten zu sinken und mehr Profit zu machen, um in der freien Marktwirschaft erfolgreich zu sein.</w:t>
+            </w:r>
           </w:p>
           <w:p>
             <w:pPr>
@@ -3973,6 +4294,19 @@
         </w:tc>
       </w:tr>
     </w:tbl>
+    <w:p>
+      <w:pPr>
+        <w:spacing w:before="80"/>
+        <w:ind w:left="284"/>
+        <w:jc w:val="both"/>
+        <w:rPr>
+          <w:rFonts w:asciiTheme="minorHAnsi" w:hAnsiTheme="minorHAnsi" w:cstheme="minorHAnsi"/>
+          <w:iCs/>
+          <w:sz w:val="20"/>
+          <w:lang w:val="de-CH"/>
+        </w:rPr>
+      </w:pPr>
+    </w:p>
     <w:p>
       <w:pPr>
         <w:numPr>
@@ -3996,7 +4330,7 @@
           <w:sz w:val="20"/>
           <w:lang w:val="de-CH"/>
         </w:rPr>
-        <w:t>Erläutern Sie den Satz: „Die Bourgeoisie kann nicht existieren, ohne die Produktionsinstrumente ... fortwährend zu revolutionieren.“</w:t>
+        <w:t>Der Kapitalismus soll periodisch zu „Überpro</w:t>
       </w:r>
       <w:r>
         <w:rPr>
@@ -4005,7 +4339,184 @@
           <w:sz w:val="20"/>
           <w:lang w:val="de-CH"/>
         </w:rPr>
-        <w:t xml:space="preserve"> (L 16f)</w:t>
+        <w:softHyphen/>
+        <w:t>duktionskrisen“ führen. Wie erklärt Marx diese These? Hat sie sich bewahrheitet?</w:t>
+      </w:r>
+      <w:r>
+        <w:rPr>
+          <w:rFonts w:asciiTheme="minorHAnsi" w:hAnsiTheme="minorHAnsi" w:cstheme="minorHAnsi"/>
+          <w:iCs/>
+          <w:sz w:val="20"/>
+          <w:lang w:val="de-CH"/>
+        </w:rPr>
+        <w:t xml:space="preserve"> (L 29-37)</w:t>
+      </w:r>
+    </w:p>
+    <w:tbl>
+      <w:tblPr>
+        <w:tblStyle w:val="TableGrid"/>
+        <w:tblW w:w="0" w:type="auto"/>
+        <w:tblInd w:w="279" w:type="dxa"/>
+        <w:tblBorders>
+          <w:top w:val="none" w:sz="0" w:space="0" w:color="auto"/>
+          <w:left w:val="none" w:sz="0" w:space="0" w:color="auto"/>
+          <w:bottom w:val="none" w:sz="0" w:space="0" w:color="auto"/>
+          <w:right w:val="none" w:sz="0" w:space="0" w:color="auto"/>
+          <w:insideH w:val="none" w:sz="0" w:space="0" w:color="auto"/>
+          <w:insideV w:val="none" w:sz="0" w:space="0" w:color="auto"/>
+        </w:tblBorders>
+        <w:tblLook w:val="04A0" w:firstRow="1" w:lastRow="0" w:firstColumn="1" w:lastColumn="0" w:noHBand="0" w:noVBand="1"/>
+      </w:tblPr>
+      <w:tblGrid>
+        <w:gridCol w:w="9690"/>
+      </w:tblGrid>
+      <w:tr>
+        <w:tc>
+          <w:tcPr>
+            <w:tcW w:w="9690" w:type="dxa"/>
+          </w:tcPr>
+          <w:p>
+            <w:pPr>
+              <w:jc w:val="both"/>
+              <w:rPr>
+                <w:rFonts w:asciiTheme="minorHAnsi" w:hAnsiTheme="minorHAnsi" w:cstheme="minorHAnsi"/>
+                <w:sz w:val="20"/>
+                <w:lang w:val="de-CH"/>
+              </w:rPr>
+            </w:pPr>
+          </w:p>
+          <w:p>
+            <w:pPr>
+              <w:jc w:val="both"/>
+              <w:rPr>
+                <w:rFonts w:asciiTheme="minorHAnsi" w:hAnsiTheme="minorHAnsi" w:cstheme="minorHAnsi"/>
+                <w:sz w:val="20"/>
+                <w:lang w:val="de-CH"/>
+              </w:rPr>
+            </w:pPr>
+            <w:r>
+              <w:rPr>
+                <w:rFonts w:asciiTheme="minorHAnsi" w:hAnsiTheme="minorHAnsi" w:cstheme="minorHAnsi"/>
+                <w:sz w:val="20"/>
+                <w:lang w:val="de-CH"/>
+              </w:rPr>
+              <w:t>Da</w:t>
+            </w:r>
+            <w:r>
+              <w:rPr>
+                <w:rFonts w:asciiTheme="minorHAnsi" w:hAnsiTheme="minorHAnsi" w:cstheme="minorHAnsi"/>
+                <w:sz w:val="20"/>
+                <w:lang w:val="de-CH"/>
+              </w:rPr>
+              <w:t xml:space="preserve"> nach der Verelendungstheorie,</w:t>
+            </w:r>
+            <w:r>
+              <w:rPr>
+                <w:rFonts w:asciiTheme="minorHAnsi" w:hAnsiTheme="minorHAnsi" w:cstheme="minorHAnsi"/>
+                <w:sz w:val="20"/>
+                <w:lang w:val="de-CH"/>
+              </w:rPr>
+              <w:t xml:space="preserve"> mit dem Druck des </w:t>
+            </w:r>
+            <w:r>
+              <w:rPr>
+                <w:rFonts w:asciiTheme="minorHAnsi" w:hAnsiTheme="minorHAnsi" w:cstheme="minorHAnsi"/>
+                <w:sz w:val="20"/>
+                <w:lang w:val="de-CH"/>
+              </w:rPr>
+              <w:t>der freien Marktwirtschaft muss die Bourgeoisie bessere Produktionsinstrumente erfinden, welche immer mehr Lohnarbeit aubl</w:t>
+            </w:r>
+            <w:r>
+              <w:rPr>
+                <w:rFonts w:asciiTheme="minorHAnsi" w:hAnsiTheme="minorHAnsi" w:cstheme="minorHAnsi"/>
+                <w:sz w:val="20"/>
+                <w:lang w:val="de-CH"/>
+              </w:rPr>
+              <w:t>ösen</w:t>
+            </w:r>
+            <w:r>
+              <w:rPr>
+                <w:rFonts w:asciiTheme="minorHAnsi" w:hAnsiTheme="minorHAnsi" w:cstheme="minorHAnsi"/>
+                <w:sz w:val="20"/>
+                <w:lang w:val="de-CH"/>
+              </w:rPr>
+              <w:t xml:space="preserve"> und zwingt sie dazu die Arbeiter immer weiter auszubeuten. Dies führt dazu, dass immer weniger Menschen Geld haben und die Kaufkraft sinkt. Der sich abber immer schneller bewegende Markt produziert somit zu viel als w</w:t>
+            </w:r>
+            <w:r>
+              <w:rPr>
+                <w:rFonts w:asciiTheme="minorHAnsi" w:hAnsiTheme="minorHAnsi" w:cstheme="minorHAnsi"/>
+                <w:sz w:val="20"/>
+                <w:lang w:val="de-CH"/>
+              </w:rPr>
+              <w:t>ürklich gekaufkt werden kann von der Bevölkerung.</w:t>
+            </w:r>
+          </w:p>
+          <w:p>
+            <w:pPr>
+              <w:jc w:val="both"/>
+              <w:rPr>
+                <w:rFonts w:asciiTheme="minorHAnsi" w:hAnsiTheme="minorHAnsi" w:cstheme="minorHAnsi"/>
+                <w:sz w:val="20"/>
+                <w:lang w:val="de-CH"/>
+              </w:rPr>
+            </w:pPr>
+            <w:r>
+              <w:rPr>
+                <w:rFonts w:asciiTheme="minorHAnsi" w:hAnsiTheme="minorHAnsi" w:cstheme="minorHAnsi"/>
+                <w:sz w:val="20"/>
+                <w:lang w:val="de-CH"/>
+              </w:rPr>
+              <w:t>Ja, siehe Weltwirschaftskriese. Im Gegensatz zu der Gscheichte, wo Kriese da waram, weil zu wenig da war. Trozdem haben mache Leute zu wenig, da nicht zuwenig da ist, sondern da es nicht richtig verteilt ist.</w:t>
+            </w:r>
+          </w:p>
+        </w:tc>
+      </w:tr>
+    </w:tbl>
+    <w:p>
+      <w:pPr>
+        <w:spacing w:before="80"/>
+        <w:jc w:val="both"/>
+        <w:rPr>
+          <w:rFonts w:asciiTheme="minorHAnsi" w:hAnsiTheme="minorHAnsi" w:cstheme="minorHAnsi"/>
+          <w:iCs/>
+          <w:sz w:val="20"/>
+          <w:lang w:val="de-CH"/>
+        </w:rPr>
+      </w:pPr>
+    </w:p>
+    <w:p>
+      <w:pPr>
+        <w:numPr>
+          <w:ilvl w:val="0"/>
+          <w:numId w:val="1"/>
+        </w:numPr>
+        <w:spacing w:before="80"/>
+        <w:ind w:left="284" w:hanging="284"/>
+        <w:jc w:val="both"/>
+        <w:rPr>
+          <w:rFonts w:asciiTheme="minorHAnsi" w:hAnsiTheme="minorHAnsi" w:cstheme="minorHAnsi"/>
+          <w:iCs/>
+          <w:sz w:val="20"/>
+          <w:lang w:val="de-CH"/>
+        </w:rPr>
+      </w:pPr>
+      <w:r>
+        <w:rPr>
+          <w:rFonts w:asciiTheme="minorHAnsi" w:hAnsiTheme="minorHAnsi" w:cstheme="minorHAnsi"/>
+          <w:iCs/>
+          <w:sz w:val="20"/>
+          <w:lang w:val="de-CH"/>
+        </w:rPr>
+        <w:t>Beurteilen Sie, inwieweit sich die Prophezeiung Marx’, wonach das „Bedürfnis nach einem stets ausgedehnteren Absatz für ihre Produkte ... die Bourgeoisie über die ganze Erdkugel“ jagt, bewahrheitet hat.</w:t>
+      </w:r>
+      <w:r>
+        <w:rPr>
+          <w:rFonts w:asciiTheme="minorHAnsi" w:hAnsiTheme="minorHAnsi" w:cstheme="minorHAnsi"/>
+          <w:iCs/>
+          <w:sz w:val="20"/>
+          <w:lang w:val="de-CH"/>
+        </w:rPr>
+        <w:t xml:space="preserve"> (L 18-20)</w:t>
       </w:r>
     </w:p>
     <w:tbl>
@@ -4044,6 +4555,15 @@
                 <w:lang w:val="de-CH"/>
               </w:rPr>
             </w:pPr>
+            <w:r>
+              <w:rPr>
+                <w:rFonts w:asciiTheme="minorHAnsi" w:hAnsiTheme="minorHAnsi" w:cstheme="minorHAnsi"/>
+                <w:iCs/>
+                <w:sz w:val="20"/>
+                <w:lang w:val="de-CH"/>
+              </w:rPr>
+              <w:t>Wie sehen dies heutzutage als die Nachfolgen der Kolonalisierung. Für Europa dient Afrika als ein guter Absatzmarkt, da ihre wirtschaft und wissenstand viel hinter europa ist aufgrund der Jahrhundert langen ausbeutung. Die USA ist (war) ein Absatzmarkt für Medikamente. Jedoch sind Europer ein Absatzmakrt für Asian bzy. China.</w:t>
+            </w:r>
           </w:p>
           <w:p>
             <w:pPr>
@@ -4055,6 +4575,15 @@
                 <w:lang w:val="de-CH"/>
               </w:rPr>
             </w:pPr>
+            <w:r>
+              <w:rPr>
+                <w:rFonts w:asciiTheme="minorHAnsi" w:hAnsiTheme="minorHAnsi" w:cstheme="minorHAnsi"/>
+                <w:iCs/>
+                <w:sz w:val="20"/>
+                <w:lang w:val="de-CH"/>
+              </w:rPr>
+              <w:t>Man sieht also deutlich, dass der Welthandel diese Aussage nur verschärft hat aufgrund der einfacheren Transportwege, welche erfunden wurden durch die «Bourgeoisie».</w:t>
+            </w:r>
           </w:p>
           <w:p>
             <w:pPr>
@@ -4066,28 +4595,15 @@
                 <w:lang w:val="de-CH"/>
               </w:rPr>
             </w:pPr>
-          </w:p>
-          <w:p>
-            <w:pPr>
-              <w:jc w:val="both"/>
+            <w:r>
               <w:rPr>
                 <w:rFonts w:asciiTheme="minorHAnsi" w:hAnsiTheme="minorHAnsi" w:cstheme="minorHAnsi"/>
                 <w:iCs/>
                 <w:sz w:val="20"/>
                 <w:lang w:val="de-CH"/>
               </w:rPr>
-            </w:pPr>
-          </w:p>
-          <w:p>
-            <w:pPr>
-              <w:jc w:val="both"/>
-              <w:rPr>
-                <w:rFonts w:asciiTheme="minorHAnsi" w:hAnsiTheme="minorHAnsi" w:cstheme="minorHAnsi"/>
-                <w:iCs/>
-                <w:sz w:val="20"/>
-                <w:lang w:val="de-CH"/>
-              </w:rPr>
-            </w:pPr>
+              <w:t>Siehe Imperialismus</w:t>
+            </w:r>
           </w:p>
           <w:p>
             <w:pPr>
@@ -4105,8 +4621,6 @@
     </w:tbl>
     <w:p>
       <w:pPr>
-        <w:spacing w:before="80"/>
-        <w:ind w:left="284"/>
         <w:jc w:val="both"/>
         <w:rPr>
           <w:rFonts w:asciiTheme="minorHAnsi" w:hAnsiTheme="minorHAnsi" w:cstheme="minorHAnsi"/>
@@ -4139,7 +4653,7 @@
           <w:sz w:val="20"/>
           <w:lang w:val="de-CH"/>
         </w:rPr>
-        <w:t>Der Kapitalismus soll periodisch zu „Überpro</w:t>
+        <w:t>Erläutern Sie die These: „Mit der Entwicklung der grossen Industrie wird also unter den Füssen der Bourgeoisie die Grundlage selbst hinweggezogen, worauf sie produziert und die Produkte sich aneignet.“</w:t>
       </w:r>
       <w:r>
         <w:rPr>
@@ -4148,17 +4662,7 @@
           <w:sz w:val="20"/>
           <w:lang w:val="de-CH"/>
         </w:rPr>
-        <w:softHyphen/>
-        <w:t>duktionskrisen“ führen. Wie erklärt Marx diese These? Hat sie sich bewahrheitet?</w:t>
-      </w:r>
-      <w:r>
-        <w:rPr>
-          <w:rFonts w:asciiTheme="minorHAnsi" w:hAnsiTheme="minorHAnsi" w:cstheme="minorHAnsi"/>
-          <w:iCs/>
-          <w:sz w:val="20"/>
-          <w:lang w:val="de-CH"/>
-        </w:rPr>
-        <w:t xml:space="preserve"> (L 29-37)</w:t>
+        <w:t xml:space="preserve"> (L 75ff)</w:t>
       </w:r>
     </w:p>
     <w:tbl>
@@ -4186,344 +4690,33 @@
                 <w:lang w:val="de-CH"/>
               </w:rPr>
             </w:pPr>
-          </w:p>
-          <w:p>
-            <w:pPr>
-              <w:jc w:val="both"/>
+            <w:r>
               <w:rPr>
                 <w:rFonts w:asciiTheme="minorHAnsi" w:hAnsiTheme="minorHAnsi" w:cstheme="minorHAnsi"/>
                 <w:iCs/>
                 <w:sz w:val="20"/>
                 <w:lang w:val="de-CH"/>
               </w:rPr>
-            </w:pPr>
-          </w:p>
-          <w:p>
-            <w:pPr>
-              <w:jc w:val="both"/>
+              <w:t>Nach der Verelendungstheorie und der Mehrwerttheorie bewirkt die Industrie, dass Lohnarbeit abnimmt und die Kaufkraft stetig sinkt. Zusammen mit dem Welthandel werden dann die Absatzmärkte zerstört und können nicht mehr die Produkte kaufen, welche Produziert werden, wodruch die Industrie wiederum kein Geld mehr verdient und auch in</w:t>
+            </w:r>
+            <w:r>
               <w:rPr>
                 <w:rFonts w:asciiTheme="minorHAnsi" w:hAnsiTheme="minorHAnsi" w:cstheme="minorHAnsi"/>
                 <w:iCs/>
                 <w:sz w:val="20"/>
                 <w:lang w:val="de-CH"/>
               </w:rPr>
-            </w:pPr>
-          </w:p>
-          <w:p>
-            <w:pPr>
-              <w:jc w:val="both"/>
+              <w:t xml:space="preserve"> </w:t>
+            </w:r>
+            <w:r>
               <w:rPr>
                 <w:rFonts w:asciiTheme="minorHAnsi" w:hAnsiTheme="minorHAnsi" w:cstheme="minorHAnsi"/>
                 <w:iCs/>
                 <w:sz w:val="20"/>
                 <w:lang w:val="de-CH"/>
               </w:rPr>
-            </w:pPr>
-          </w:p>
-          <w:p>
-            <w:pPr>
-              <w:jc w:val="both"/>
-              <w:rPr>
-                <w:rFonts w:asciiTheme="minorHAnsi" w:hAnsiTheme="minorHAnsi" w:cstheme="minorHAnsi"/>
-                <w:iCs/>
-                <w:sz w:val="20"/>
-                <w:lang w:val="de-CH"/>
-              </w:rPr>
-            </w:pPr>
-          </w:p>
-          <w:p>
-            <w:pPr>
-              <w:jc w:val="both"/>
-              <w:rPr>
-                <w:rFonts w:asciiTheme="minorHAnsi" w:hAnsiTheme="minorHAnsi" w:cstheme="minorHAnsi"/>
-                <w:iCs/>
-                <w:sz w:val="20"/>
-                <w:lang w:val="de-CH"/>
-              </w:rPr>
-            </w:pPr>
-          </w:p>
-          <w:p>
-            <w:pPr>
-              <w:jc w:val="both"/>
-              <w:rPr>
-                <w:rFonts w:asciiTheme="minorHAnsi" w:hAnsiTheme="minorHAnsi" w:cstheme="minorHAnsi"/>
-                <w:iCs/>
-                <w:sz w:val="20"/>
-                <w:lang w:val="de-CH"/>
-              </w:rPr>
-            </w:pPr>
-          </w:p>
-        </w:tc>
-      </w:tr>
-    </w:tbl>
-    <w:p>
-      <w:pPr>
-        <w:spacing w:before="80"/>
-        <w:jc w:val="both"/>
-        <w:rPr>
-          <w:rFonts w:asciiTheme="minorHAnsi" w:hAnsiTheme="minorHAnsi" w:cstheme="minorHAnsi"/>
-          <w:iCs/>
-          <w:sz w:val="20"/>
-          <w:lang w:val="de-CH"/>
-        </w:rPr>
-      </w:pPr>
-    </w:p>
-    <w:p>
-      <w:pPr>
-        <w:numPr>
-          <w:ilvl w:val="0"/>
-          <w:numId w:val="1"/>
-        </w:numPr>
-        <w:spacing w:before="80"/>
-        <w:ind w:left="284" w:hanging="284"/>
-        <w:jc w:val="both"/>
-        <w:rPr>
-          <w:rFonts w:asciiTheme="minorHAnsi" w:hAnsiTheme="minorHAnsi" w:cstheme="minorHAnsi"/>
-          <w:iCs/>
-          <w:sz w:val="20"/>
-          <w:lang w:val="de-CH"/>
-        </w:rPr>
-      </w:pPr>
-      <w:r>
-        <w:rPr>
-          <w:rFonts w:asciiTheme="minorHAnsi" w:hAnsiTheme="minorHAnsi" w:cstheme="minorHAnsi"/>
-          <w:iCs/>
-          <w:sz w:val="20"/>
-          <w:lang w:val="de-CH"/>
-        </w:rPr>
-        <w:t>Beurteilen Sie, inwieweit sich die Prophezeiung Marx’, wonach das „Bedürfnis nach einem stets ausgedehnteren Absatz für ihre Produkte ... die Bourgeoisie über die ganze Erdkugel“ jagt, bewahrheitet hat.</w:t>
-      </w:r>
-      <w:r>
-        <w:rPr>
-          <w:rFonts w:asciiTheme="minorHAnsi" w:hAnsiTheme="minorHAnsi" w:cstheme="minorHAnsi"/>
-          <w:iCs/>
-          <w:sz w:val="20"/>
-          <w:lang w:val="de-CH"/>
-        </w:rPr>
-        <w:t xml:space="preserve"> (L 18-20)</w:t>
-      </w:r>
-    </w:p>
-    <w:tbl>
-      <w:tblPr>
-        <w:tblStyle w:val="TableGrid"/>
-        <w:tblW w:w="0" w:type="auto"/>
-        <w:tblInd w:w="279" w:type="dxa"/>
-        <w:tblLook w:val="04A0" w:firstRow="1" w:lastRow="0" w:firstColumn="1" w:lastColumn="0" w:noHBand="0" w:noVBand="1"/>
-      </w:tblPr>
-      <w:tblGrid>
-        <w:gridCol w:w="9690"/>
-      </w:tblGrid>
-      <w:tr>
-        <w:tc>
-          <w:tcPr>
-            <w:tcW w:w="9690" w:type="dxa"/>
-          </w:tcPr>
-          <w:p>
-            <w:pPr>
-              <w:jc w:val="both"/>
-              <w:rPr>
-                <w:rFonts w:asciiTheme="minorHAnsi" w:hAnsiTheme="minorHAnsi" w:cstheme="minorHAnsi"/>
-                <w:iCs/>
-                <w:sz w:val="20"/>
-                <w:lang w:val="de-CH"/>
-              </w:rPr>
-            </w:pPr>
-          </w:p>
-          <w:p>
-            <w:pPr>
-              <w:jc w:val="both"/>
-              <w:rPr>
-                <w:rFonts w:asciiTheme="minorHAnsi" w:hAnsiTheme="minorHAnsi" w:cstheme="minorHAnsi"/>
-                <w:iCs/>
-                <w:sz w:val="20"/>
-                <w:lang w:val="de-CH"/>
-              </w:rPr>
-            </w:pPr>
-          </w:p>
-          <w:p>
-            <w:pPr>
-              <w:jc w:val="both"/>
-              <w:rPr>
-                <w:rFonts w:asciiTheme="minorHAnsi" w:hAnsiTheme="minorHAnsi" w:cstheme="minorHAnsi"/>
-                <w:iCs/>
-                <w:sz w:val="20"/>
-                <w:lang w:val="de-CH"/>
-              </w:rPr>
-            </w:pPr>
-          </w:p>
-          <w:p>
-            <w:pPr>
-              <w:jc w:val="both"/>
-              <w:rPr>
-                <w:rFonts w:asciiTheme="minorHAnsi" w:hAnsiTheme="minorHAnsi" w:cstheme="minorHAnsi"/>
-                <w:iCs/>
-                <w:sz w:val="20"/>
-                <w:lang w:val="de-CH"/>
-              </w:rPr>
-            </w:pPr>
-          </w:p>
-          <w:p>
-            <w:pPr>
-              <w:jc w:val="both"/>
-              <w:rPr>
-                <w:rFonts w:asciiTheme="minorHAnsi" w:hAnsiTheme="minorHAnsi" w:cstheme="minorHAnsi"/>
-                <w:iCs/>
-                <w:sz w:val="20"/>
-                <w:lang w:val="de-CH"/>
-              </w:rPr>
-            </w:pPr>
-          </w:p>
-          <w:p>
-            <w:pPr>
-              <w:jc w:val="both"/>
-              <w:rPr>
-                <w:rFonts w:asciiTheme="minorHAnsi" w:hAnsiTheme="minorHAnsi" w:cstheme="minorHAnsi"/>
-                <w:iCs/>
-                <w:sz w:val="20"/>
-                <w:lang w:val="de-CH"/>
-              </w:rPr>
-            </w:pPr>
-          </w:p>
-          <w:p>
-            <w:pPr>
-              <w:jc w:val="both"/>
-              <w:rPr>
-                <w:rFonts w:asciiTheme="minorHAnsi" w:hAnsiTheme="minorHAnsi" w:cstheme="minorHAnsi"/>
-                <w:iCs/>
-                <w:sz w:val="20"/>
-                <w:lang w:val="de-CH"/>
-              </w:rPr>
-            </w:pPr>
-          </w:p>
-        </w:tc>
-      </w:tr>
-    </w:tbl>
-    <w:p>
-      <w:pPr>
-        <w:jc w:val="both"/>
-        <w:rPr>
-          <w:rFonts w:asciiTheme="minorHAnsi" w:hAnsiTheme="minorHAnsi" w:cstheme="minorHAnsi"/>
-          <w:iCs/>
-          <w:sz w:val="20"/>
-          <w:lang w:val="de-CH"/>
-        </w:rPr>
-      </w:pPr>
-    </w:p>
-    <w:p>
-      <w:pPr>
-        <w:numPr>
-          <w:ilvl w:val="0"/>
-          <w:numId w:val="1"/>
-        </w:numPr>
-        <w:spacing w:before="80"/>
-        <w:ind w:left="284" w:hanging="284"/>
-        <w:jc w:val="both"/>
-        <w:rPr>
-          <w:rFonts w:asciiTheme="minorHAnsi" w:hAnsiTheme="minorHAnsi" w:cstheme="minorHAnsi"/>
-          <w:iCs/>
-          <w:sz w:val="20"/>
-          <w:lang w:val="de-CH"/>
-        </w:rPr>
-      </w:pPr>
-      <w:r>
-        <w:rPr>
-          <w:rFonts w:asciiTheme="minorHAnsi" w:hAnsiTheme="minorHAnsi" w:cstheme="minorHAnsi"/>
-          <w:iCs/>
-          <w:sz w:val="20"/>
-          <w:lang w:val="de-CH"/>
-        </w:rPr>
-        <w:t>Erläutern Sie die These: „Mit der Entwicklung der grossen Industrie wird also unter den Füssen der Bourgeoisie die Grundlage selbst hinweggezogen, worauf sie produziert und die Produkte sich aneignet.“</w:t>
-      </w:r>
-      <w:r>
-        <w:rPr>
-          <w:rFonts w:asciiTheme="minorHAnsi" w:hAnsiTheme="minorHAnsi" w:cstheme="minorHAnsi"/>
-          <w:iCs/>
-          <w:sz w:val="20"/>
-          <w:lang w:val="de-CH"/>
-        </w:rPr>
-        <w:t xml:space="preserve"> (L 75ff)</w:t>
-      </w:r>
-    </w:p>
-    <w:tbl>
-      <w:tblPr>
-        <w:tblStyle w:val="TableGrid"/>
-        <w:tblW w:w="0" w:type="auto"/>
-        <w:tblInd w:w="279" w:type="dxa"/>
-        <w:tblLook w:val="04A0" w:firstRow="1" w:lastRow="0" w:firstColumn="1" w:lastColumn="0" w:noHBand="0" w:noVBand="1"/>
-      </w:tblPr>
-      <w:tblGrid>
-        <w:gridCol w:w="9690"/>
-      </w:tblGrid>
-      <w:tr>
-        <w:tc>
-          <w:tcPr>
-            <w:tcW w:w="9690" w:type="dxa"/>
-          </w:tcPr>
-          <w:p>
-            <w:pPr>
-              <w:jc w:val="both"/>
-              <w:rPr>
-                <w:rFonts w:asciiTheme="minorHAnsi" w:hAnsiTheme="minorHAnsi" w:cstheme="minorHAnsi"/>
-                <w:iCs/>
-                <w:sz w:val="20"/>
-                <w:lang w:val="de-CH"/>
-              </w:rPr>
-            </w:pPr>
-          </w:p>
-          <w:p>
-            <w:pPr>
-              <w:jc w:val="both"/>
-              <w:rPr>
-                <w:rFonts w:asciiTheme="minorHAnsi" w:hAnsiTheme="minorHAnsi" w:cstheme="minorHAnsi"/>
-                <w:iCs/>
-                <w:sz w:val="20"/>
-                <w:lang w:val="de-CH"/>
-              </w:rPr>
-            </w:pPr>
-          </w:p>
-          <w:p>
-            <w:pPr>
-              <w:jc w:val="both"/>
-              <w:rPr>
-                <w:rFonts w:asciiTheme="minorHAnsi" w:hAnsiTheme="minorHAnsi" w:cstheme="minorHAnsi"/>
-                <w:iCs/>
-                <w:sz w:val="20"/>
-                <w:lang w:val="de-CH"/>
-              </w:rPr>
-            </w:pPr>
-          </w:p>
-          <w:p>
-            <w:pPr>
-              <w:jc w:val="both"/>
-              <w:rPr>
-                <w:rFonts w:asciiTheme="minorHAnsi" w:hAnsiTheme="minorHAnsi" w:cstheme="minorHAnsi"/>
-                <w:iCs/>
-                <w:sz w:val="20"/>
-                <w:lang w:val="de-CH"/>
-              </w:rPr>
-            </w:pPr>
-          </w:p>
-          <w:p>
-            <w:pPr>
-              <w:jc w:val="both"/>
-              <w:rPr>
-                <w:rFonts w:asciiTheme="minorHAnsi" w:hAnsiTheme="minorHAnsi" w:cstheme="minorHAnsi"/>
-                <w:iCs/>
-                <w:sz w:val="20"/>
-                <w:lang w:val="de-CH"/>
-              </w:rPr>
-            </w:pPr>
-          </w:p>
-          <w:p>
-            <w:pPr>
-              <w:jc w:val="both"/>
-              <w:rPr>
-                <w:rFonts w:asciiTheme="minorHAnsi" w:hAnsiTheme="minorHAnsi" w:cstheme="minorHAnsi"/>
-                <w:iCs/>
-                <w:sz w:val="20"/>
-                <w:lang w:val="de-CH"/>
-              </w:rPr>
-            </w:pPr>
+              <w:t>die Ruine fällt.</w:t>
+            </w:r>
           </w:p>
           <w:p>
             <w:pPr>

</xml_diff>